<commit_message>
fejl del 3 elasticitet
</commit_message>
<xml_diff>
--- a/files/2024-03-EO-SOL.docx
+++ b/files/2024-03-EO-SOL.docx
@@ -700,7 +700,6 @@
                     <w:bottom w:val="nil"/>
                     <w:right w:val="single" w:sz="8" w:space="0" w:color="auto"/>
                   </w:tcBorders>
-                  <w:shd w:val="clear" w:color="auto" w:fill="auto"/>
                   <w:noWrap/>
                   <w:vAlign w:val="center"/>
                   <w:hideMark/>
@@ -729,7 +728,6 @@
                     <w:bottom w:val="nil"/>
                     <w:right w:val="single" w:sz="8" w:space="0" w:color="auto"/>
                   </w:tcBorders>
-                  <w:shd w:val="clear" w:color="auto" w:fill="auto"/>
                   <w:noWrap/>
                   <w:vAlign w:val="center"/>
                   <w:hideMark/>
@@ -758,7 +756,6 @@
                     <w:bottom w:val="nil"/>
                     <w:right w:val="single" w:sz="8" w:space="0" w:color="auto"/>
                   </w:tcBorders>
-                  <w:shd w:val="clear" w:color="auto" w:fill="auto"/>
                   <w:noWrap/>
                   <w:vAlign w:val="center"/>
                   <w:hideMark/>
@@ -793,7 +790,6 @@
                     <w:bottom w:val="single" w:sz="8" w:space="0" w:color="auto"/>
                     <w:right w:val="single" w:sz="8" w:space="0" w:color="auto"/>
                   </w:tcBorders>
-                  <w:shd w:val="clear" w:color="auto" w:fill="auto"/>
                   <w:noWrap/>
                   <w:vAlign w:val="center"/>
                   <w:hideMark/>
@@ -822,7 +818,6 @@
                     <w:bottom w:val="single" w:sz="8" w:space="0" w:color="auto"/>
                     <w:right w:val="single" w:sz="8" w:space="0" w:color="auto"/>
                   </w:tcBorders>
-                  <w:shd w:val="clear" w:color="auto" w:fill="auto"/>
                   <w:noWrap/>
                   <w:vAlign w:val="center"/>
                   <w:hideMark/>
@@ -852,7 +847,6 @@
                     <w:bottom w:val="single" w:sz="8" w:space="0" w:color="auto"/>
                     <w:right w:val="single" w:sz="8" w:space="0" w:color="auto"/>
                   </w:tcBorders>
-                  <w:shd w:val="clear" w:color="auto" w:fill="auto"/>
                   <w:noWrap/>
                   <w:vAlign w:val="center"/>
                   <w:hideMark/>
@@ -888,7 +882,6 @@
                     <w:bottom w:val="single" w:sz="8" w:space="0" w:color="auto"/>
                     <w:right w:val="single" w:sz="8" w:space="0" w:color="auto"/>
                   </w:tcBorders>
-                  <w:shd w:val="clear" w:color="auto" w:fill="auto"/>
                   <w:noWrap/>
                   <w:vAlign w:val="center"/>
                   <w:hideMark/>
@@ -917,7 +910,6 @@
                     <w:bottom w:val="single" w:sz="8" w:space="0" w:color="auto"/>
                     <w:right w:val="single" w:sz="8" w:space="0" w:color="auto"/>
                   </w:tcBorders>
-                  <w:shd w:val="clear" w:color="auto" w:fill="auto"/>
                   <w:noWrap/>
                   <w:vAlign w:val="center"/>
                   <w:hideMark/>
@@ -947,7 +939,6 @@
                     <w:bottom w:val="single" w:sz="8" w:space="0" w:color="auto"/>
                     <w:right w:val="single" w:sz="8" w:space="0" w:color="auto"/>
                   </w:tcBorders>
-                  <w:shd w:val="clear" w:color="auto" w:fill="auto"/>
                   <w:noWrap/>
                   <w:vAlign w:val="center"/>
                   <w:hideMark/>
@@ -983,7 +974,6 @@
                     <w:bottom w:val="single" w:sz="8" w:space="0" w:color="auto"/>
                     <w:right w:val="single" w:sz="8" w:space="0" w:color="auto"/>
                   </w:tcBorders>
-                  <w:shd w:val="clear" w:color="auto" w:fill="auto"/>
                   <w:noWrap/>
                   <w:vAlign w:val="center"/>
                   <w:hideMark/>
@@ -1012,7 +1002,6 @@
                     <w:bottom w:val="single" w:sz="8" w:space="0" w:color="auto"/>
                     <w:right w:val="single" w:sz="8" w:space="0" w:color="auto"/>
                   </w:tcBorders>
-                  <w:shd w:val="clear" w:color="auto" w:fill="auto"/>
                   <w:noWrap/>
                   <w:vAlign w:val="center"/>
                   <w:hideMark/>
@@ -1042,7 +1031,6 @@
                     <w:bottom w:val="single" w:sz="8" w:space="0" w:color="auto"/>
                     <w:right w:val="single" w:sz="8" w:space="0" w:color="auto"/>
                   </w:tcBorders>
-                  <w:shd w:val="clear" w:color="auto" w:fill="auto"/>
                   <w:noWrap/>
                   <w:vAlign w:val="center"/>
                   <w:hideMark/>
@@ -1078,7 +1066,6 @@
                     <w:bottom w:val="single" w:sz="8" w:space="0" w:color="auto"/>
                     <w:right w:val="single" w:sz="8" w:space="0" w:color="auto"/>
                   </w:tcBorders>
-                  <w:shd w:val="clear" w:color="auto" w:fill="auto"/>
                   <w:noWrap/>
                   <w:vAlign w:val="center"/>
                   <w:hideMark/>
@@ -1107,7 +1094,6 @@
                     <w:bottom w:val="single" w:sz="8" w:space="0" w:color="auto"/>
                     <w:right w:val="single" w:sz="8" w:space="0" w:color="auto"/>
                   </w:tcBorders>
-                  <w:shd w:val="clear" w:color="auto" w:fill="auto"/>
                   <w:noWrap/>
                   <w:vAlign w:val="center"/>
                   <w:hideMark/>
@@ -1137,7 +1123,6 @@
                     <w:bottom w:val="single" w:sz="8" w:space="0" w:color="auto"/>
                     <w:right w:val="single" w:sz="8" w:space="0" w:color="auto"/>
                   </w:tcBorders>
-                  <w:shd w:val="clear" w:color="auto" w:fill="auto"/>
                   <w:noWrap/>
                   <w:vAlign w:val="center"/>
                   <w:hideMark/>
@@ -1173,7 +1158,6 @@
                     <w:bottom w:val="single" w:sz="8" w:space="0" w:color="auto"/>
                     <w:right w:val="single" w:sz="8" w:space="0" w:color="auto"/>
                   </w:tcBorders>
-                  <w:shd w:val="clear" w:color="auto" w:fill="auto"/>
                   <w:noWrap/>
                   <w:vAlign w:val="center"/>
                   <w:hideMark/>
@@ -1202,7 +1186,6 @@
                     <w:bottom w:val="single" w:sz="8" w:space="0" w:color="auto"/>
                     <w:right w:val="single" w:sz="8" w:space="0" w:color="auto"/>
                   </w:tcBorders>
-                  <w:shd w:val="clear" w:color="auto" w:fill="auto"/>
                   <w:noWrap/>
                   <w:vAlign w:val="center"/>
                   <w:hideMark/>
@@ -1232,7 +1215,6 @@
                     <w:bottom w:val="single" w:sz="8" w:space="0" w:color="auto"/>
                     <w:right w:val="single" w:sz="8" w:space="0" w:color="auto"/>
                   </w:tcBorders>
-                  <w:shd w:val="clear" w:color="auto" w:fill="auto"/>
                   <w:noWrap/>
                   <w:vAlign w:val="center"/>
                   <w:hideMark/>
@@ -1268,7 +1250,6 @@
                     <w:bottom w:val="single" w:sz="8" w:space="0" w:color="auto"/>
                     <w:right w:val="single" w:sz="8" w:space="0" w:color="auto"/>
                   </w:tcBorders>
-                  <w:shd w:val="clear" w:color="auto" w:fill="auto"/>
                   <w:noWrap/>
                   <w:vAlign w:val="center"/>
                   <w:hideMark/>
@@ -1297,7 +1278,6 @@
                     <w:bottom w:val="single" w:sz="8" w:space="0" w:color="auto"/>
                     <w:right w:val="single" w:sz="8" w:space="0" w:color="auto"/>
                   </w:tcBorders>
-                  <w:shd w:val="clear" w:color="auto" w:fill="auto"/>
                   <w:noWrap/>
                   <w:vAlign w:val="center"/>
                   <w:hideMark/>
@@ -1327,7 +1307,6 @@
                     <w:bottom w:val="single" w:sz="8" w:space="0" w:color="auto"/>
                     <w:right w:val="single" w:sz="8" w:space="0" w:color="auto"/>
                   </w:tcBorders>
-                  <w:shd w:val="clear" w:color="auto" w:fill="auto"/>
                   <w:noWrap/>
                   <w:vAlign w:val="center"/>
                   <w:hideMark/>
@@ -1363,7 +1342,6 @@
                     <w:bottom w:val="single" w:sz="8" w:space="0" w:color="auto"/>
                     <w:right w:val="single" w:sz="8" w:space="0" w:color="auto"/>
                   </w:tcBorders>
-                  <w:shd w:val="clear" w:color="auto" w:fill="auto"/>
                   <w:noWrap/>
                   <w:vAlign w:val="center"/>
                   <w:hideMark/>
@@ -1392,7 +1370,6 @@
                     <w:bottom w:val="single" w:sz="8" w:space="0" w:color="auto"/>
                     <w:right w:val="single" w:sz="8" w:space="0" w:color="auto"/>
                   </w:tcBorders>
-                  <w:shd w:val="clear" w:color="auto" w:fill="auto"/>
                   <w:noWrap/>
                   <w:vAlign w:val="center"/>
                   <w:hideMark/>
@@ -1422,7 +1399,6 @@
                     <w:bottom w:val="single" w:sz="8" w:space="0" w:color="auto"/>
                     <w:right w:val="single" w:sz="8" w:space="0" w:color="auto"/>
                   </w:tcBorders>
-                  <w:shd w:val="clear" w:color="auto" w:fill="auto"/>
                   <w:noWrap/>
                   <w:vAlign w:val="center"/>
                   <w:hideMark/>
@@ -1458,7 +1434,6 @@
                     <w:bottom w:val="single" w:sz="8" w:space="0" w:color="auto"/>
                     <w:right w:val="single" w:sz="8" w:space="0" w:color="auto"/>
                   </w:tcBorders>
-                  <w:shd w:val="clear" w:color="auto" w:fill="auto"/>
                   <w:noWrap/>
                   <w:vAlign w:val="center"/>
                   <w:hideMark/>
@@ -1487,7 +1462,6 @@
                     <w:bottom w:val="single" w:sz="8" w:space="0" w:color="auto"/>
                     <w:right w:val="single" w:sz="8" w:space="0" w:color="auto"/>
                   </w:tcBorders>
-                  <w:shd w:val="clear" w:color="auto" w:fill="auto"/>
                   <w:noWrap/>
                   <w:vAlign w:val="center"/>
                   <w:hideMark/>
@@ -1517,7 +1491,6 @@
                     <w:bottom w:val="single" w:sz="8" w:space="0" w:color="auto"/>
                     <w:right w:val="single" w:sz="8" w:space="0" w:color="auto"/>
                   </w:tcBorders>
-                  <w:shd w:val="clear" w:color="auto" w:fill="auto"/>
                   <w:noWrap/>
                   <w:vAlign w:val="center"/>
                   <w:hideMark/>
@@ -1553,7 +1526,6 @@
                     <w:bottom w:val="single" w:sz="8" w:space="0" w:color="auto"/>
                     <w:right w:val="single" w:sz="8" w:space="0" w:color="auto"/>
                   </w:tcBorders>
-                  <w:shd w:val="clear" w:color="auto" w:fill="auto"/>
                   <w:noWrap/>
                   <w:vAlign w:val="center"/>
                   <w:hideMark/>
@@ -1582,7 +1554,6 @@
                     <w:bottom w:val="single" w:sz="8" w:space="0" w:color="auto"/>
                     <w:right w:val="single" w:sz="8" w:space="0" w:color="auto"/>
                   </w:tcBorders>
-                  <w:shd w:val="clear" w:color="auto" w:fill="auto"/>
                   <w:noWrap/>
                   <w:vAlign w:val="center"/>
                   <w:hideMark/>
@@ -1612,7 +1583,6 @@
                     <w:bottom w:val="single" w:sz="8" w:space="0" w:color="auto"/>
                     <w:right w:val="single" w:sz="8" w:space="0" w:color="auto"/>
                   </w:tcBorders>
-                  <w:shd w:val="clear" w:color="auto" w:fill="auto"/>
                   <w:noWrap/>
                   <w:vAlign w:val="center"/>
                   <w:hideMark/>
@@ -1648,7 +1618,6 @@
                     <w:bottom w:val="single" w:sz="8" w:space="0" w:color="auto"/>
                     <w:right w:val="single" w:sz="8" w:space="0" w:color="auto"/>
                   </w:tcBorders>
-                  <w:shd w:val="clear" w:color="auto" w:fill="auto"/>
                   <w:noWrap/>
                   <w:vAlign w:val="center"/>
                   <w:hideMark/>
@@ -1677,7 +1646,6 @@
                     <w:bottom w:val="single" w:sz="8" w:space="0" w:color="auto"/>
                     <w:right w:val="single" w:sz="8" w:space="0" w:color="auto"/>
                   </w:tcBorders>
-                  <w:shd w:val="clear" w:color="auto" w:fill="auto"/>
                   <w:noWrap/>
                   <w:vAlign w:val="center"/>
                   <w:hideMark/>
@@ -1707,7 +1675,6 @@
                     <w:bottom w:val="single" w:sz="8" w:space="0" w:color="auto"/>
                     <w:right w:val="single" w:sz="8" w:space="0" w:color="auto"/>
                   </w:tcBorders>
-                  <w:shd w:val="clear" w:color="auto" w:fill="auto"/>
                   <w:noWrap/>
                   <w:vAlign w:val="center"/>
                   <w:hideMark/>
@@ -1743,7 +1710,6 @@
                     <w:bottom w:val="single" w:sz="8" w:space="0" w:color="auto"/>
                     <w:right w:val="single" w:sz="8" w:space="0" w:color="auto"/>
                   </w:tcBorders>
-                  <w:shd w:val="clear" w:color="auto" w:fill="auto"/>
                   <w:noWrap/>
                   <w:vAlign w:val="center"/>
                   <w:hideMark/>
@@ -1772,7 +1738,6 @@
                     <w:bottom w:val="single" w:sz="8" w:space="0" w:color="auto"/>
                     <w:right w:val="single" w:sz="8" w:space="0" w:color="auto"/>
                   </w:tcBorders>
-                  <w:shd w:val="clear" w:color="auto" w:fill="auto"/>
                   <w:noWrap/>
                   <w:vAlign w:val="center"/>
                   <w:hideMark/>
@@ -1802,7 +1767,6 @@
                     <w:bottom w:val="single" w:sz="8" w:space="0" w:color="auto"/>
                     <w:right w:val="single" w:sz="8" w:space="0" w:color="auto"/>
                   </w:tcBorders>
-                  <w:shd w:val="clear" w:color="auto" w:fill="auto"/>
                   <w:noWrap/>
                   <w:vAlign w:val="center"/>
                   <w:hideMark/>
@@ -1838,7 +1802,6 @@
                     <w:bottom w:val="single" w:sz="8" w:space="0" w:color="auto"/>
                     <w:right w:val="single" w:sz="8" w:space="0" w:color="auto"/>
                   </w:tcBorders>
-                  <w:shd w:val="clear" w:color="auto" w:fill="auto"/>
                   <w:noWrap/>
                   <w:vAlign w:val="center"/>
                   <w:hideMark/>
@@ -1867,7 +1830,6 @@
                     <w:bottom w:val="single" w:sz="8" w:space="0" w:color="auto"/>
                     <w:right w:val="single" w:sz="8" w:space="0" w:color="auto"/>
                   </w:tcBorders>
-                  <w:shd w:val="clear" w:color="auto" w:fill="auto"/>
                   <w:noWrap/>
                   <w:vAlign w:val="center"/>
                   <w:hideMark/>
@@ -1897,7 +1859,6 @@
                     <w:bottom w:val="single" w:sz="8" w:space="0" w:color="auto"/>
                     <w:right w:val="single" w:sz="8" w:space="0" w:color="auto"/>
                   </w:tcBorders>
-                  <w:shd w:val="clear" w:color="auto" w:fill="auto"/>
                   <w:noWrap/>
                   <w:vAlign w:val="center"/>
                   <w:hideMark/>
@@ -1934,7 +1895,6 @@
                     <w:bottom w:val="single" w:sz="8" w:space="0" w:color="auto"/>
                     <w:right w:val="single" w:sz="8" w:space="0" w:color="000000"/>
                   </w:tcBorders>
-                  <w:shd w:val="clear" w:color="auto" w:fill="auto"/>
                   <w:noWrap/>
                   <w:vAlign w:val="center"/>
                   <w:hideMark/>
@@ -1964,7 +1924,6 @@
                     <w:bottom w:val="single" w:sz="8" w:space="0" w:color="auto"/>
                     <w:right w:val="single" w:sz="8" w:space="0" w:color="auto"/>
                   </w:tcBorders>
-                  <w:shd w:val="clear" w:color="auto" w:fill="auto"/>
                   <w:noWrap/>
                   <w:vAlign w:val="center"/>
                   <w:hideMark/>
@@ -3152,6 +3111,7 @@
       <w:r>
         <w:rPr>
           <w:rFonts w:cs="Calibri"/>
+          <w:noProof/>
           <w:sz w:val="24"/>
           <w:szCs w:val="24"/>
         </w:rPr>
@@ -3226,9 +3186,12 @@
           <w:szCs w:val="24"/>
           <w:highlight w:val="yellow"/>
         </w:rPr>
-        <w:t>O</w:t>
-      </w:r>
-      <w:r>
+        <w:t>Optimal salgspris 356,25 DKK.</w:t>
+      </w:r>
+    </w:p>
+    <w:p>
+      <w:pPr>
+        <w:spacing w:after="0" w:line="240" w:lineRule="auto"/>
         <w:rPr>
           <w:rFonts w:cstheme="minorHAnsi"/>
           <w:bCs/>
@@ -3238,8 +3201,7 @@
           <w:szCs w:val="24"/>
           <w:highlight w:val="yellow"/>
         </w:rPr>
-        <w:t>ptimal salgspris</w:t>
-      </w:r>
+      </w:pPr>
       <w:r>
         <w:rPr>
           <w:rFonts w:cstheme="minorHAnsi"/>
@@ -3250,7 +3212,7 @@
           <w:szCs w:val="24"/>
           <w:highlight w:val="yellow"/>
         </w:rPr>
-        <w:t xml:space="preserve"> 356,25 DKK.</w:t>
+        <w:t>Optimal mængde 625 stk.</w:t>
       </w:r>
     </w:p>
     <w:p>
@@ -3263,7 +3225,6 @@
           <w:iCs/>
           <w:sz w:val="24"/>
           <w:szCs w:val="24"/>
-          <w:highlight w:val="yellow"/>
         </w:rPr>
       </w:pPr>
       <w:r>
@@ -3276,80 +3237,7 @@
           <w:szCs w:val="24"/>
           <w:highlight w:val="yellow"/>
         </w:rPr>
-        <w:t>O</w:t>
-      </w:r>
-      <w:r>
-        <w:rPr>
-          <w:rFonts w:cstheme="minorHAnsi"/>
-          <w:bCs/>
-          <w:i/>
-          <w:iCs/>
-          <w:sz w:val="24"/>
-          <w:szCs w:val="24"/>
-          <w:highlight w:val="yellow"/>
-        </w:rPr>
-        <w:t>ptimal mængde</w:t>
-      </w:r>
-      <w:r>
-        <w:rPr>
-          <w:rFonts w:cstheme="minorHAnsi"/>
-          <w:bCs/>
-          <w:i/>
-          <w:iCs/>
-          <w:sz w:val="24"/>
-          <w:szCs w:val="24"/>
-          <w:highlight w:val="yellow"/>
-        </w:rPr>
-        <w:t xml:space="preserve"> 625 stk.</w:t>
-      </w:r>
-    </w:p>
-    <w:p>
-      <w:pPr>
-        <w:spacing w:after="0" w:line="240" w:lineRule="auto"/>
-        <w:rPr>
-          <w:rFonts w:cstheme="minorHAnsi"/>
-          <w:bCs/>
-          <w:i/>
-          <w:iCs/>
-          <w:sz w:val="24"/>
-          <w:szCs w:val="24"/>
-        </w:rPr>
-      </w:pPr>
-      <w:r>
-        <w:rPr>
-          <w:rFonts w:cstheme="minorHAnsi"/>
-          <w:bCs/>
-          <w:i/>
-          <w:iCs/>
-          <w:sz w:val="24"/>
-          <w:szCs w:val="24"/>
-          <w:highlight w:val="yellow"/>
-        </w:rPr>
-        <w:t>D</w:t>
-      </w:r>
-      <w:r>
-        <w:rPr>
-          <w:rFonts w:cstheme="minorHAnsi"/>
-          <w:bCs/>
-          <w:i/>
-          <w:iCs/>
-          <w:sz w:val="24"/>
-          <w:szCs w:val="24"/>
-          <w:highlight w:val="yellow"/>
-        </w:rPr>
-        <w:t>ækningsbidrag</w:t>
-      </w:r>
-      <w:r>
-        <w:rPr>
-          <w:rFonts w:cstheme="minorHAnsi"/>
-          <w:bCs/>
-          <w:i/>
-          <w:iCs/>
-          <w:sz w:val="24"/>
-          <w:szCs w:val="24"/>
-          <w:highlight w:val="yellow"/>
-        </w:rPr>
-        <w:t xml:space="preserve"> 62.500 DKK.</w:t>
+        <w:t>Dækningsbidrag 62.500 DKK.</w:t>
       </w:r>
     </w:p>
     <w:p>
@@ -3568,6 +3456,7 @@
         <w:rPr>
           <w:rFonts w:cs="Calibri"/>
           <w:b/>
+          <w:noProof/>
           <w:sz w:val="24"/>
           <w:szCs w:val="24"/>
         </w:rPr>
@@ -3630,8 +3519,30 @@
           <w:szCs w:val="24"/>
           <w:highlight w:val="yellow"/>
         </w:rPr>
-        <w:t>Optimal salgspris</w:t>
-      </w:r>
+        <w:t xml:space="preserve">Optimal salgspris </w:t>
+      </w:r>
+      <w:r>
+        <w:rPr>
+          <w:rFonts w:ascii="Segoe UI" w:hAnsi="Segoe UI" w:cs="Segoe UI"/>
+          <w:i/>
+          <w:iCs/>
+          <w:color w:val="212529"/>
+          <w:highlight w:val="yellow"/>
+        </w:rPr>
+        <w:t xml:space="preserve">365,00 DKK på markedet </w:t>
+      </w:r>
+    </w:p>
+    <w:p>
+      <w:pPr>
+        <w:spacing w:after="0" w:line="240" w:lineRule="auto"/>
+        <w:rPr>
+          <w:rFonts w:ascii="Segoe UI" w:hAnsi="Segoe UI" w:cs="Segoe UI"/>
+          <w:i/>
+          <w:iCs/>
+          <w:color w:val="212529"/>
+          <w:highlight w:val="yellow"/>
+        </w:rPr>
+      </w:pPr>
       <w:r>
         <w:rPr>
           <w:rFonts w:cstheme="minorHAnsi"/>
@@ -3642,7 +3553,7 @@
           <w:szCs w:val="24"/>
           <w:highlight w:val="yellow"/>
         </w:rPr>
-        <w:t xml:space="preserve"> </w:t>
+        <w:t xml:space="preserve">Optimal salgspris </w:t>
       </w:r>
       <w:r>
         <w:rPr>
@@ -3652,7 +3563,7 @@
           <w:color w:val="212529"/>
           <w:highlight w:val="yellow"/>
         </w:rPr>
-        <w:t xml:space="preserve">365,00 DKK på markedet </w:t>
+        <w:t>280,00 DKK på ordren</w:t>
       </w:r>
     </w:p>
     <w:p>
@@ -3676,8 +3587,30 @@
           <w:szCs w:val="24"/>
           <w:highlight w:val="yellow"/>
         </w:rPr>
-        <w:t>Optimal salgspris</w:t>
-      </w:r>
+        <w:t xml:space="preserve">Optimal mængde 566,67 stk. </w:t>
+      </w:r>
+      <w:r>
+        <w:rPr>
+          <w:rFonts w:ascii="Segoe UI" w:hAnsi="Segoe UI" w:cs="Segoe UI"/>
+          <w:i/>
+          <w:iCs/>
+          <w:color w:val="212529"/>
+          <w:highlight w:val="yellow"/>
+        </w:rPr>
+        <w:t xml:space="preserve">på markedet </w:t>
+      </w:r>
+    </w:p>
+    <w:p>
+      <w:pPr>
+        <w:spacing w:after="0" w:line="240" w:lineRule="auto"/>
+        <w:rPr>
+          <w:rFonts w:ascii="Segoe UI" w:hAnsi="Segoe UI" w:cs="Segoe UI"/>
+          <w:i/>
+          <w:iCs/>
+          <w:color w:val="212529"/>
+          <w:highlight w:val="yellow"/>
+        </w:rPr>
+      </w:pPr>
       <w:r>
         <w:rPr>
           <w:rFonts w:cstheme="minorHAnsi"/>
@@ -3688,7 +3621,7 @@
           <w:szCs w:val="24"/>
           <w:highlight w:val="yellow"/>
         </w:rPr>
-        <w:t xml:space="preserve"> </w:t>
+        <w:t xml:space="preserve">Optimal mængde 933,33 stk. </w:t>
       </w:r>
       <w:r>
         <w:rPr>
@@ -3698,32 +3631,21 @@
           <w:color w:val="212529"/>
           <w:highlight w:val="yellow"/>
         </w:rPr>
-        <w:t>280,00 DKK på ordren</w:t>
+        <w:t>på ordren</w:t>
       </w:r>
     </w:p>
     <w:p>
       <w:pPr>
         <w:spacing w:after="0" w:line="240" w:lineRule="auto"/>
         <w:rPr>
-          <w:rFonts w:ascii="Segoe UI" w:hAnsi="Segoe UI" w:cs="Segoe UI"/>
-          <w:i/>
-          <w:iCs/>
-          <w:color w:val="212529"/>
-          <w:highlight w:val="yellow"/>
-        </w:rPr>
-      </w:pPr>
-      <w:r>
-        <w:rPr>
           <w:rFonts w:cstheme="minorHAnsi"/>
           <w:bCs/>
           <w:i/>
           <w:iCs/>
           <w:sz w:val="24"/>
           <w:szCs w:val="24"/>
-          <w:highlight w:val="yellow"/>
-        </w:rPr>
-        <w:t xml:space="preserve">Optimal mængde </w:t>
-      </w:r>
+        </w:rPr>
+      </w:pPr>
       <w:r>
         <w:rPr>
           <w:rFonts w:cstheme="minorHAnsi"/>
@@ -3734,208 +3656,7 @@
           <w:szCs w:val="24"/>
           <w:highlight w:val="yellow"/>
         </w:rPr>
-        <w:t>566,67</w:t>
-      </w:r>
-      <w:r>
-        <w:rPr>
-          <w:rFonts w:cstheme="minorHAnsi"/>
-          <w:bCs/>
-          <w:i/>
-          <w:iCs/>
-          <w:sz w:val="24"/>
-          <w:szCs w:val="24"/>
-          <w:highlight w:val="yellow"/>
-        </w:rPr>
-        <w:t xml:space="preserve"> stk.</w:t>
-      </w:r>
-      <w:r>
-        <w:rPr>
-          <w:rFonts w:cstheme="minorHAnsi"/>
-          <w:bCs/>
-          <w:i/>
-          <w:iCs/>
-          <w:sz w:val="24"/>
-          <w:szCs w:val="24"/>
-          <w:highlight w:val="yellow"/>
-        </w:rPr>
-        <w:t xml:space="preserve"> </w:t>
-      </w:r>
-      <w:r>
-        <w:rPr>
-          <w:rFonts w:ascii="Segoe UI" w:hAnsi="Segoe UI" w:cs="Segoe UI"/>
-          <w:i/>
-          <w:iCs/>
-          <w:color w:val="212529"/>
-          <w:highlight w:val="yellow"/>
-        </w:rPr>
-        <w:t xml:space="preserve">på markedet </w:t>
-      </w:r>
-    </w:p>
-    <w:p>
-      <w:pPr>
-        <w:spacing w:after="0" w:line="240" w:lineRule="auto"/>
-        <w:rPr>
-          <w:rFonts w:ascii="Segoe UI" w:hAnsi="Segoe UI" w:cs="Segoe UI"/>
-          <w:i/>
-          <w:iCs/>
-          <w:color w:val="212529"/>
-          <w:highlight w:val="yellow"/>
-        </w:rPr>
-      </w:pPr>
-      <w:r>
-        <w:rPr>
-          <w:rFonts w:cstheme="minorHAnsi"/>
-          <w:bCs/>
-          <w:i/>
-          <w:iCs/>
-          <w:sz w:val="24"/>
-          <w:szCs w:val="24"/>
-          <w:highlight w:val="yellow"/>
-        </w:rPr>
-        <w:t xml:space="preserve">Optimal mængde </w:t>
-      </w:r>
-      <w:r>
-        <w:rPr>
-          <w:rFonts w:cstheme="minorHAnsi"/>
-          <w:bCs/>
-          <w:i/>
-          <w:iCs/>
-          <w:sz w:val="24"/>
-          <w:szCs w:val="24"/>
-          <w:highlight w:val="yellow"/>
-        </w:rPr>
-        <w:t>933</w:t>
-      </w:r>
-      <w:r>
-        <w:rPr>
-          <w:rFonts w:cstheme="minorHAnsi"/>
-          <w:bCs/>
-          <w:i/>
-          <w:iCs/>
-          <w:sz w:val="24"/>
-          <w:szCs w:val="24"/>
-          <w:highlight w:val="yellow"/>
-        </w:rPr>
-        <w:t>,</w:t>
-      </w:r>
-      <w:r>
-        <w:rPr>
-          <w:rFonts w:cstheme="minorHAnsi"/>
-          <w:bCs/>
-          <w:i/>
-          <w:iCs/>
-          <w:sz w:val="24"/>
-          <w:szCs w:val="24"/>
-          <w:highlight w:val="yellow"/>
-        </w:rPr>
-        <w:t>33</w:t>
-      </w:r>
-      <w:r>
-        <w:rPr>
-          <w:rFonts w:cstheme="minorHAnsi"/>
-          <w:bCs/>
-          <w:i/>
-          <w:iCs/>
-          <w:sz w:val="24"/>
-          <w:szCs w:val="24"/>
-          <w:highlight w:val="yellow"/>
-        </w:rPr>
-        <w:t xml:space="preserve"> stk.</w:t>
-      </w:r>
-      <w:r>
-        <w:rPr>
-          <w:rFonts w:cstheme="minorHAnsi"/>
-          <w:bCs/>
-          <w:i/>
-          <w:iCs/>
-          <w:sz w:val="24"/>
-          <w:szCs w:val="24"/>
-          <w:highlight w:val="yellow"/>
-        </w:rPr>
-        <w:t xml:space="preserve"> </w:t>
-      </w:r>
-      <w:r>
-        <w:rPr>
-          <w:rFonts w:ascii="Segoe UI" w:hAnsi="Segoe UI" w:cs="Segoe UI"/>
-          <w:i/>
-          <w:iCs/>
-          <w:color w:val="212529"/>
-          <w:highlight w:val="yellow"/>
-        </w:rPr>
-        <w:t>på ordren</w:t>
-      </w:r>
-    </w:p>
-    <w:p>
-      <w:pPr>
-        <w:spacing w:after="0" w:line="240" w:lineRule="auto"/>
-        <w:rPr>
-          <w:rFonts w:cstheme="minorHAnsi"/>
-          <w:bCs/>
-          <w:i/>
-          <w:iCs/>
-          <w:sz w:val="24"/>
-          <w:szCs w:val="24"/>
-        </w:rPr>
-      </w:pPr>
-      <w:r>
-        <w:rPr>
-          <w:rFonts w:cstheme="minorHAnsi"/>
-          <w:bCs/>
-          <w:i/>
-          <w:iCs/>
-          <w:sz w:val="24"/>
-          <w:szCs w:val="24"/>
-          <w:highlight w:val="yellow"/>
-        </w:rPr>
-        <w:t xml:space="preserve">Dækningsbidrag </w:t>
-      </w:r>
-      <w:r>
-        <w:rPr>
-          <w:rFonts w:cstheme="minorHAnsi"/>
-          <w:bCs/>
-          <w:i/>
-          <w:iCs/>
-          <w:sz w:val="24"/>
-          <w:szCs w:val="24"/>
-          <w:highlight w:val="yellow"/>
-        </w:rPr>
-        <w:t>70</w:t>
-      </w:r>
-      <w:r>
-        <w:rPr>
-          <w:rFonts w:cstheme="minorHAnsi"/>
-          <w:bCs/>
-          <w:i/>
-          <w:iCs/>
-          <w:sz w:val="24"/>
-          <w:szCs w:val="24"/>
-          <w:highlight w:val="yellow"/>
-        </w:rPr>
-        <w:t>.</w:t>
-      </w:r>
-      <w:r>
-        <w:rPr>
-          <w:rFonts w:cstheme="minorHAnsi"/>
-          <w:bCs/>
-          <w:i/>
-          <w:iCs/>
-          <w:sz w:val="24"/>
-          <w:szCs w:val="24"/>
-          <w:highlight w:val="yellow"/>
-        </w:rPr>
-        <w:t>666,67</w:t>
-      </w:r>
-      <w:r>
-        <w:rPr>
-          <w:rFonts w:cstheme="minorHAnsi"/>
-          <w:bCs/>
-          <w:i/>
-          <w:iCs/>
-          <w:sz w:val="24"/>
-          <w:szCs w:val="24"/>
-          <w:highlight w:val="yellow"/>
-        </w:rPr>
-        <w:t xml:space="preserve"> DKK</w:t>
+        <w:t>Dækningsbidrag 70.666,67 DKK</w:t>
       </w:r>
       <w:r>
         <w:rPr>
@@ -4972,6 +4693,7 @@
       <w:r>
         <w:rPr>
           <w:rFonts w:eastAsia="Calibri" w:cs="Calibri"/>
+          <w:noProof/>
           <w:color w:val="000000" w:themeColor="text1"/>
           <w:sz w:val="24"/>
           <w:szCs w:val="24"/>
@@ -5103,55 +4825,7 @@
           <w:szCs w:val="24"/>
           <w:highlight w:val="yellow"/>
         </w:rPr>
-        <w:t xml:space="preserve">Ved forventet </w:t>
-      </w:r>
-      <w:r>
-        <w:rPr>
-          <w:rFonts w:eastAsia="Calibri" w:cs="Calibri"/>
-          <w:i/>
-          <w:iCs/>
-          <w:color w:val="000000" w:themeColor="text1"/>
-          <w:sz w:val="24"/>
-          <w:szCs w:val="24"/>
-          <w:highlight w:val="yellow"/>
-        </w:rPr>
-        <w:t xml:space="preserve">1 mio. </w:t>
-      </w:r>
-      <w:r>
-        <w:rPr>
-          <w:rFonts w:eastAsia="Calibri" w:cs="Calibri"/>
-          <w:i/>
-          <w:iCs/>
-          <w:color w:val="000000" w:themeColor="text1"/>
-          <w:sz w:val="24"/>
-          <w:szCs w:val="24"/>
-          <w:highlight w:val="yellow"/>
-        </w:rPr>
-        <w:t>solg</w:t>
-      </w:r>
-      <w:r>
-        <w:rPr>
-          <w:rFonts w:eastAsia="Calibri" w:cs="Calibri"/>
-          <w:i/>
-          <w:iCs/>
-          <w:color w:val="000000" w:themeColor="text1"/>
-          <w:sz w:val="24"/>
-          <w:szCs w:val="24"/>
-          <w:highlight w:val="yellow"/>
-        </w:rPr>
-        <w:t>te</w:t>
-      </w:r>
-      <w:r>
-        <w:rPr>
-          <w:rFonts w:eastAsia="Calibri" w:cs="Calibri"/>
-          <w:i/>
-          <w:iCs/>
-          <w:color w:val="000000" w:themeColor="text1"/>
-          <w:sz w:val="24"/>
-          <w:szCs w:val="24"/>
-          <w:highlight w:val="yellow"/>
-        </w:rPr>
-        <w:t xml:space="preserve"> enheder</w:t>
+        <w:t>Ved forventet 1 mio. solgte enheder</w:t>
       </w:r>
       <w:r>
         <w:rPr>
@@ -5559,17 +5233,7 @@
           <w:color w:val="000000" w:themeColor="text1"/>
           <w:highlight w:val="yellow"/>
         </w:rPr>
-        <w:t>X=172,98</w:t>
-      </w:r>
-      <w:r>
-        <w:rPr>
-          <w:bCs/>
-          <w:i/>
-          <w:iCs/>
-          <w:color w:val="000000" w:themeColor="text1"/>
-          <w:highlight w:val="yellow"/>
-        </w:rPr>
-        <w:t>/</w:t>
+        <w:t>X=172,98/</w:t>
       </w:r>
       <w:r>
         <w:rPr>
@@ -5787,6 +5451,7 @@
       <w:r>
         <w:rPr>
           <w:b/>
+          <w:noProof/>
           <w:color w:val="000000" w:themeColor="text1"/>
         </w:rPr>
         <w:lastRenderedPageBreak/>
@@ -6065,7 +5730,21 @@
           <w:rStyle w:val="normaltextrun"/>
           <w:rFonts w:ascii="Calibri" w:hAnsi="Calibri" w:cs="Calibri"/>
         </w:rPr>
-        <w:t>P = -0,20M + 475</w:t>
+        <w:t>P = -0,</w:t>
+      </w:r>
+      <w:r>
+        <w:rPr>
+          <w:rStyle w:val="normaltextrun"/>
+          <w:rFonts w:ascii="Calibri" w:hAnsi="Calibri" w:cs="Calibri"/>
+        </w:rPr>
+        <w:t>0</w:t>
+      </w:r>
+      <w:r>
+        <w:rPr>
+          <w:rStyle w:val="normaltextrun"/>
+          <w:rFonts w:ascii="Calibri" w:hAnsi="Calibri" w:cs="Calibri"/>
+        </w:rPr>
+        <w:t>2M + 475</w:t>
       </w:r>
       <w:r>
         <w:rPr>
@@ -6216,6 +5895,7 @@
           <w:rFonts w:cs="Calibri"/>
           <w:b/>
           <w:bCs/>
+          <w:noProof/>
           <w:color w:val="000000" w:themeColor="text1"/>
           <w:sz w:val="24"/>
           <w:szCs w:val="24"/>
@@ -6580,29 +6260,7 @@
           <w:iCs/>
           <w:highlight w:val="yellow"/>
         </w:rPr>
-        <w:t>237,5 = -0,</w:t>
-      </w:r>
-      <w:r>
-        <w:rPr>
-          <w:rStyle w:val="normaltextrun"/>
-          <w:rFonts w:ascii="Calibri" w:hAnsi="Calibri" w:cs="Calibri"/>
-          <w:bCs/>
-          <w:i/>
-          <w:iCs/>
-          <w:highlight w:val="yellow"/>
-        </w:rPr>
-        <w:t>0</w:t>
-      </w:r>
-      <w:r>
-        <w:rPr>
-          <w:rStyle w:val="normaltextrun"/>
-          <w:rFonts w:ascii="Calibri" w:hAnsi="Calibri" w:cs="Calibri"/>
-          <w:bCs/>
-          <w:i/>
-          <w:iCs/>
-          <w:highlight w:val="yellow"/>
-        </w:rPr>
-        <w:t>2M + 475</w:t>
+        <w:t>237,5 = -0,02M + 475</w:t>
       </w:r>
       <w:r>
         <w:rPr>
@@ -6663,9 +6321,14 @@
           <w:iCs/>
           <w:highlight w:val="yellow"/>
         </w:rPr>
-        <w:t>0,</w:t>
-      </w:r>
-      <w:r>
+        <w:t>0,02M = 237,5</w:t>
+      </w:r>
+    </w:p>
+    <w:p>
+      <w:pPr>
+        <w:pStyle w:val="paragraph"/>
+        <w:spacing w:before="0" w:beforeAutospacing="0" w:after="0" w:afterAutospacing="0"/>
+        <w:textAlignment w:val="baseline"/>
         <w:rPr>
           <w:rStyle w:val="eop"/>
           <w:rFonts w:ascii="Calibri" w:hAnsi="Calibri" w:cs="Calibri"/>
@@ -6674,8 +6337,7 @@
           <w:iCs/>
           <w:highlight w:val="yellow"/>
         </w:rPr>
-        <w:t>0</w:t>
-      </w:r>
+      </w:pPr>
       <w:r>
         <w:rPr>
           <w:rStyle w:val="eop"/>
@@ -6685,7 +6347,7 @@
           <w:iCs/>
           <w:highlight w:val="yellow"/>
         </w:rPr>
-        <w:t>2M = 237,5</w:t>
+        <w:t>M = 237,5/0,02</w:t>
       </w:r>
     </w:p>
     <w:p>
@@ -6699,7 +6361,6 @@
           <w:bCs/>
           <w:i/>
           <w:iCs/>
-          <w:highlight w:val="yellow"/>
         </w:rPr>
       </w:pPr>
       <w:r>
@@ -6711,18 +6372,32 @@
           <w:iCs/>
           <w:highlight w:val="yellow"/>
         </w:rPr>
-        <w:t>M = 237,5</w:t>
-      </w:r>
-      <w:r>
+        <w:t>M= 11.875 stk.</w:t>
+      </w:r>
+    </w:p>
+    <w:p>
+      <w:pPr>
+        <w:pStyle w:val="paragraph"/>
+        <w:spacing w:before="0" w:beforeAutospacing="0" w:after="0" w:afterAutospacing="0"/>
+        <w:textAlignment w:val="baseline"/>
         <w:rPr>
           <w:rStyle w:val="eop"/>
           <w:rFonts w:ascii="Calibri" w:hAnsi="Calibri" w:cs="Calibri"/>
           <w:bCs/>
           <w:i/>
           <w:iCs/>
+        </w:rPr>
+      </w:pPr>
+      <w:r>
+        <w:rPr>
+          <w:rStyle w:val="eop"/>
+          <w:rFonts w:ascii="Calibri" w:hAnsi="Calibri" w:cs="Calibri"/>
+          <w:bCs/>
+          <w:i/>
+          <w:iCs/>
           <w:highlight w:val="yellow"/>
         </w:rPr>
-        <w:t>/0,02</w:t>
+        <w:t>Afsætningen er altså 11.873 stk.</w:t>
       </w:r>
     </w:p>
     <w:p>
@@ -6731,78 +6406,6 @@
         <w:spacing w:before="0" w:beforeAutospacing="0" w:after="0" w:afterAutospacing="0"/>
         <w:textAlignment w:val="baseline"/>
         <w:rPr>
-          <w:rStyle w:val="eop"/>
-          <w:rFonts w:ascii="Calibri" w:hAnsi="Calibri" w:cs="Calibri"/>
-          <w:bCs/>
-          <w:i/>
-          <w:iCs/>
-        </w:rPr>
-      </w:pPr>
-      <w:r>
-        <w:rPr>
-          <w:rStyle w:val="eop"/>
-          <w:rFonts w:ascii="Calibri" w:hAnsi="Calibri" w:cs="Calibri"/>
-          <w:bCs/>
-          <w:i/>
-          <w:iCs/>
-          <w:highlight w:val="yellow"/>
-        </w:rPr>
-        <w:t xml:space="preserve">M= </w:t>
-      </w:r>
-      <w:r>
-        <w:rPr>
-          <w:rStyle w:val="eop"/>
-          <w:rFonts w:ascii="Calibri" w:hAnsi="Calibri" w:cs="Calibri"/>
-          <w:bCs/>
-          <w:i/>
-          <w:iCs/>
-          <w:highlight w:val="yellow"/>
-        </w:rPr>
-        <w:t>11.875</w:t>
-      </w:r>
-      <w:r>
-        <w:rPr>
-          <w:rStyle w:val="eop"/>
-          <w:rFonts w:ascii="Calibri" w:hAnsi="Calibri" w:cs="Calibri"/>
-          <w:bCs/>
-          <w:i/>
-          <w:iCs/>
-          <w:highlight w:val="yellow"/>
-        </w:rPr>
-        <w:t xml:space="preserve"> stk.</w:t>
-      </w:r>
-    </w:p>
-    <w:p>
-      <w:pPr>
-        <w:pStyle w:val="paragraph"/>
-        <w:spacing w:before="0" w:beforeAutospacing="0" w:after="0" w:afterAutospacing="0"/>
-        <w:textAlignment w:val="baseline"/>
-        <w:rPr>
-          <w:rStyle w:val="eop"/>
-          <w:rFonts w:ascii="Calibri" w:hAnsi="Calibri" w:cs="Calibri"/>
-          <w:bCs/>
-          <w:i/>
-          <w:iCs/>
-        </w:rPr>
-      </w:pPr>
-      <w:r>
-        <w:rPr>
-          <w:rStyle w:val="eop"/>
-          <w:rFonts w:ascii="Calibri" w:hAnsi="Calibri" w:cs="Calibri"/>
-          <w:bCs/>
-          <w:i/>
-          <w:iCs/>
-          <w:highlight w:val="yellow"/>
-        </w:rPr>
-        <w:t>Afsætningen er altså 11.873 stk.</w:t>
-      </w:r>
-    </w:p>
-    <w:p>
-      <w:pPr>
-        <w:pStyle w:val="paragraph"/>
-        <w:spacing w:before="0" w:beforeAutospacing="0" w:after="0" w:afterAutospacing="0"/>
-        <w:textAlignment w:val="baseline"/>
-        <w:rPr>
           <w:rFonts w:ascii="Segoe UI" w:hAnsi="Segoe UI" w:cs="Segoe UI"/>
           <w:bCs/>
           <w:i/>
@@ -6817,27 +6420,7 @@
           <w:iCs/>
           <w:highlight w:val="yellow"/>
         </w:rPr>
-        <w:t>P</w:t>
-      </w:r>
-      <w:r>
-        <w:rPr>
-          <w:rFonts w:ascii="Segoe UI" w:hAnsi="Segoe UI" w:cs="Segoe UI"/>
-          <w:bCs/>
-          <w:i/>
-          <w:iCs/>
-          <w:highlight w:val="yellow"/>
-        </w:rPr>
-        <w:t>riselasticiteten</w:t>
-      </w:r>
-      <w:r>
-        <w:rPr>
-          <w:rFonts w:ascii="Segoe UI" w:hAnsi="Segoe UI" w:cs="Segoe UI"/>
-          <w:bCs/>
-          <w:i/>
-          <w:iCs/>
-          <w:highlight w:val="yellow"/>
-        </w:rPr>
-        <w:t xml:space="preserve"> er altid -1 ved prisen der maksimerer omsætningen. Når prisen hæves 1% falder afsætningen 1%</w:t>
+        <w:t>Priselasticiteten er altid -1 ved prisen der maksimerer omsætningen. Når prisen hæves 1% falder afsætningen 1%</w:t>
       </w:r>
     </w:p>
     <w:p>
@@ -7029,6 +6612,7 @@
           <w:rFonts w:ascii="Cambria" w:hAnsi="Cambria" w:cs="Segoe UI"/>
           <w:b/>
           <w:bCs/>
+          <w:noProof/>
           <w:color w:val="365F91"/>
           <w:sz w:val="28"/>
           <w:szCs w:val="28"/>
@@ -8051,29 +7635,7 @@
           <w:szCs w:val="24"/>
           <w:highlight w:val="yellow"/>
         </w:rPr>
-        <w:t xml:space="preserve">Resultat = </w:t>
-      </w:r>
-      <w:r>
-        <w:rPr>
-          <w:bCs/>
-          <w:i/>
-          <w:iCs/>
-          <w:sz w:val="24"/>
-          <w:szCs w:val="24"/>
-          <w:highlight w:val="yellow"/>
-        </w:rPr>
-        <w:t>121.000</w:t>
-      </w:r>
-      <w:r>
-        <w:rPr>
-          <w:bCs/>
-          <w:i/>
-          <w:iCs/>
-          <w:sz w:val="24"/>
-          <w:szCs w:val="24"/>
-          <w:highlight w:val="yellow"/>
-        </w:rPr>
-        <w:t xml:space="preserve"> – 50.000 = 71.000,-</w:t>
+        <w:t>Resultat = 121.000 – 50.000 = 71.000,-</w:t>
       </w:r>
     </w:p>
     <w:p>
@@ -8097,6 +7659,7 @@
       <w:r>
         <w:rPr>
           <w:rFonts w:cs="Calibri"/>
+          <w:noProof/>
           <w:sz w:val="24"/>
           <w:szCs w:val="24"/>
         </w:rPr>
@@ -13830,9 +13393,6 @@
         <w:p>
           <w:pPr>
             <w:pStyle w:val="592D61A36B834FF9A6129A16A70264E3"/>
-            <w:rPr>
-              <w:rFonts w:hint="eastAsia"/>
-            </w:rPr>
           </w:pPr>
           <w:r>
             <w:rPr>
@@ -13862,7 +13422,7 @@
     <w:charset w:val="00"/>
     <w:family w:val="swiss"/>
     <w:pitch w:val="variable"/>
-    <w:sig w:usb0="E4002EFF" w:usb1="C000247B" w:usb2="00000009" w:usb3="00000000" w:csb0="000001FF" w:csb1="00000000"/>
+    <w:sig w:usb0="E0002AFF" w:usb1="C000247B" w:usb2="00000009" w:usb3="00000000" w:csb0="000001FF" w:csb1="00000000"/>
   </w:font>
   <w:font w:name="Courier New">
     <w:panose1 w:val="02070309020205020404"/>
@@ -13873,10 +13433,10 @@
   </w:font>
   <w:font w:name="Wingdings">
     <w:panose1 w:val="05000000000000000000"/>
-    <w:charset w:val="02"/>
-    <w:family w:val="auto"/>
+    <w:charset w:val="4D"/>
+    <w:family w:val="decorative"/>
     <w:pitch w:val="variable"/>
-    <w:sig w:usb0="00000000" w:usb1="10000000" w:usb2="00000000" w:usb3="00000000" w:csb0="80000000" w:csb1="00000000"/>
+    <w:sig w:usb0="00000003" w:usb1="00000000" w:usb2="00000000" w:usb3="00000000" w:csb0="80000001" w:csb1="00000000"/>
   </w:font>
   <w:font w:name="Symbol">
     <w:panose1 w:val="05050102010706020507"/>
@@ -13912,7 +13472,7 @@
     <w:charset w:val="00"/>
     <w:family w:val="swiss"/>
     <w:pitch w:val="variable"/>
-    <w:sig w:usb0="E0002EFF" w:usb1="C000785B" w:usb2="00000009" w:usb3="00000000" w:csb0="000001FF" w:csb1="00000000"/>
+    <w:sig w:usb0="E0002AFF" w:usb1="C0007843" w:usb2="00000009" w:usb3="00000000" w:csb0="000001FF" w:csb1="00000000"/>
   </w:font>
   <w:font w:name="Yu Gothic Light">
     <w:altName w:val="游ゴシック Light"/>
@@ -13927,7 +13487,7 @@
     <w:charset w:val="00"/>
     <w:family w:val="swiss"/>
     <w:pitch w:val="variable"/>
-    <w:sig w:usb0="E4002EFF" w:usb1="C000247B" w:usb2="00000009" w:usb3="00000000" w:csb0="000001FF" w:csb1="00000000"/>
+    <w:sig w:usb0="E0002AFF" w:usb1="C000247B" w:usb2="00000009" w:usb3="00000000" w:csb0="000001FF" w:csb1="00000000"/>
   </w:font>
   <w:font w:name="Yu Mincho">
     <w:altName w:val="游明朝"/>
@@ -13940,16 +13500,16 @@
   <w:font w:name="Aptos">
     <w:panose1 w:val="020B0004020202020204"/>
     <w:charset w:val="00"/>
-    <w:family w:val="roman"/>
-    <w:notTrueType/>
-    <w:pitch w:val="default"/>
+    <w:family w:val="swiss"/>
+    <w:pitch w:val="variable"/>
+    <w:sig w:usb0="20000287" w:usb1="00000003" w:usb2="00000000" w:usb3="00000000" w:csb0="0000019F" w:csb1="00000000"/>
   </w:font>
   <w:font w:name="Aptos Display">
     <w:panose1 w:val="020B0004020202020204"/>
     <w:charset w:val="00"/>
-    <w:family w:val="roman"/>
-    <w:notTrueType/>
-    <w:pitch w:val="default"/>
+    <w:family w:val="swiss"/>
+    <w:pitch w:val="variable"/>
+    <w:sig w:usb0="20000287" w:usb1="00000003" w:usb2="00000000" w:usb3="00000000" w:csb0="0000019F" w:csb1="00000000"/>
   </w:font>
 </w:fonts>
 </file>
@@ -13974,9 +13534,11 @@
     <w:rsid w:val="001600E6"/>
     <w:rsid w:val="00201BD1"/>
     <w:rsid w:val="00845173"/>
+    <w:rsid w:val="008574A0"/>
     <w:rsid w:val="00893C9F"/>
     <w:rsid w:val="00B868F5"/>
     <w:rsid w:val="00CE6D9C"/>
+    <w:rsid w:val="00E959ED"/>
   </w:rsids>
   <m:mathPr>
     <m:mathFont m:val="Cambria Math"/>
@@ -14713,6 +14275,19 @@
 </file>
 
 <file path=customXml/item1.xml><?xml version="1.0" encoding="utf-8"?>
+<b:Sources xmlns:b="http://schemas.openxmlformats.org/officeDocument/2006/bibliography" xmlns="http://schemas.openxmlformats.org/officeDocument/2006/bibliography" SelectedStyle="\APASixthEditionOfficeOnline.xsl" StyleName="APA" Version="6"/>
+</file>
+
+<file path=customXml/item2.xml><?xml version="1.0" encoding="utf-8"?>
+<?mso-contentType ?>
+<FormTemplates xmlns="http://schemas.microsoft.com/sharepoint/v3/contenttype/forms">
+  <Display>DocumentLibraryForm</Display>
+  <Edit>DocumentLibraryForm</Edit>
+  <New>DocumentLibraryForm</New>
+</FormTemplates>
+</file>
+
+<file path=customXml/item3.xml><?xml version="1.0" encoding="utf-8"?>
 <ct:contentTypeSchema xmlns:ct="http://schemas.microsoft.com/office/2006/metadata/contentType" xmlns:ma="http://schemas.microsoft.com/office/2006/metadata/properties/metaAttributes" ct:_="" ma:_="" ma:contentTypeName="Dokument" ma:contentTypeID="0x010100A42150DA7EBAE146A0008195A4976989" ma:contentTypeVersion="22" ma:contentTypeDescription="Opret et nyt dokument." ma:contentTypeScope="" ma:versionID="bb49a8d41e2132d2fd9bf186ff06d321">
   <xsd:schema xmlns:xsd="http://www.w3.org/2001/XMLSchema" xmlns:xs="http://www.w3.org/2001/XMLSchema" xmlns:p="http://schemas.microsoft.com/office/2006/metadata/properties" xmlns:ns1="http://schemas.microsoft.com/sharepoint/v3" xmlns:ns2="0ff1153b-be98-465d-a7ff-36bc3c69af6c" xmlns:ns3="c7e2ecf6-e361-4159-9367-86aa4c26842f" xmlns:ns4="c3c11eb6-de36-4131-bab2-6a22847efc48" targetNamespace="http://schemas.microsoft.com/office/2006/metadata/properties" ma:root="true" ma:fieldsID="17e0d2fe9dcd414a9c9b93b92d334190" ns1:_="" ns2:_="" ns3:_="" ns4:_="">
     <xsd:import namespace="http://schemas.microsoft.com/sharepoint/v3"/>
@@ -15001,19 +14576,6 @@
 </ct:contentTypeSchema>
 </file>
 
-<file path=customXml/item2.xml><?xml version="1.0" encoding="utf-8"?>
-<?mso-contentType ?>
-<FormTemplates xmlns="http://schemas.microsoft.com/sharepoint/v3/contenttype/forms">
-  <Display>DocumentLibraryForm</Display>
-  <Edit>DocumentLibraryForm</Edit>
-  <New>DocumentLibraryForm</New>
-</FormTemplates>
-</file>
-
-<file path=customXml/item3.xml><?xml version="1.0" encoding="utf-8"?>
-<b:Sources xmlns:b="http://schemas.openxmlformats.org/officeDocument/2006/bibliography" xmlns="http://schemas.openxmlformats.org/officeDocument/2006/bibliography" SelectedStyle="\APASixthEditionOfficeOnline.xsl" StyleName="APA" Version="6"/>
-</file>
-
 <file path=customXml/item4.xml><?xml version="1.0" encoding="utf-8"?>
 <p:properties xmlns:p="http://schemas.microsoft.com/office/2006/metadata/properties" xmlns:xsi="http://www.w3.org/2001/XMLSchema-instance" xmlns:pc="http://schemas.microsoft.com/office/infopath/2007/PartnerControls">
   <documentManagement>
@@ -15030,6 +14592,22 @@
 </file>
 
 <file path=customXml/itemProps1.xml><?xml version="1.0" encoding="utf-8"?>
+<ds:datastoreItem xmlns:ds="http://schemas.openxmlformats.org/officeDocument/2006/customXml" ds:itemID="{0CD21416-CB03-48BC-8B28-BA3D85D25538}">
+  <ds:schemaRefs>
+    <ds:schemaRef ds:uri="http://schemas.openxmlformats.org/officeDocument/2006/bibliography"/>
+  </ds:schemaRefs>
+</ds:datastoreItem>
+</file>
+
+<file path=customXml/itemProps2.xml><?xml version="1.0" encoding="utf-8"?>
+<ds:datastoreItem xmlns:ds="http://schemas.openxmlformats.org/officeDocument/2006/customXml" ds:itemID="{BC1E995A-8739-4F00-A9DB-FEC610CF2201}">
+  <ds:schemaRefs>
+    <ds:schemaRef ds:uri="http://schemas.microsoft.com/sharepoint/v3/contenttype/forms"/>
+  </ds:schemaRefs>
+</ds:datastoreItem>
+</file>
+
+<file path=customXml/itemProps3.xml><?xml version="1.0" encoding="utf-8"?>
 <ds:datastoreItem xmlns:ds="http://schemas.openxmlformats.org/officeDocument/2006/customXml" ds:itemID="{81500867-297F-47B8-B6CF-E86CC7A02F52}">
   <ds:schemaRefs>
     <ds:schemaRef ds:uri="http://schemas.microsoft.com/office/2006/metadata/contentType"/>
@@ -15050,22 +14628,6 @@
 </ds:datastoreItem>
 </file>
 
-<file path=customXml/itemProps2.xml><?xml version="1.0" encoding="utf-8"?>
-<ds:datastoreItem xmlns:ds="http://schemas.openxmlformats.org/officeDocument/2006/customXml" ds:itemID="{BC1E995A-8739-4F00-A9DB-FEC610CF2201}">
-  <ds:schemaRefs>
-    <ds:schemaRef ds:uri="http://schemas.microsoft.com/sharepoint/v3/contenttype/forms"/>
-  </ds:schemaRefs>
-</ds:datastoreItem>
-</file>
-
-<file path=customXml/itemProps3.xml><?xml version="1.0" encoding="utf-8"?>
-<ds:datastoreItem xmlns:ds="http://schemas.openxmlformats.org/officeDocument/2006/customXml" ds:itemID="{0CD21416-CB03-48BC-8B28-BA3D85D25538}">
-  <ds:schemaRefs>
-    <ds:schemaRef ds:uri="http://schemas.openxmlformats.org/officeDocument/2006/bibliography"/>
-  </ds:schemaRefs>
-</ds:datastoreItem>
-</file>
-
 <file path=customXml/itemProps4.xml><?xml version="1.0" encoding="utf-8"?>
 <ds:datastoreItem xmlns:ds="http://schemas.openxmlformats.org/officeDocument/2006/customXml" ds:itemID="{0A1C0F80-DD73-4326-97B7-E93464BCA3ED}">
   <ds:schemaRefs>

</xml_diff>